<commit_message>
Update SDD Introduction with rephrased scope and assumptions
- Rephrased Authoring Model section for clarity
- Revised In Scope to match TFS requirements (integrations, MSM, URLs, assets, workflows)
- Simplified Out of Scope to focus on downstream/API boundaries
- Replaced granular assumptions with 4 key TFS-specific assumptions
  (authoring shift, public URL requirement, MSM baseline, Edge Worker decision)

Co-Authored-By: Claude Opus 4.6 (1M context) <noreply@anthropic.com>
</commit_message>
<xml_diff>
--- a/docs/sdd-introduction-scope.docx
+++ b/docs/sdd-introduction-scope.docx
@@ -57,7 +57,7 @@
         <w:pStyle w:val="ListBullet"/>
       </w:pPr>
       <w:r>
-        <w:t>Target State: AEM Edge Delivery Services with Document Authoring (DA) — a performance-first, document-based content platform served from a global edge CDN.</w:t>
+        <w:t>Target State: AEM Edge Delivery Services with Document Authoring (DA) — a performance-first, document-based content platform served from a global edge CDN with sub-second page loads. Authors create content through a web-based editor at da.live, and the architecture eliminates JCR repositories, OSGi configurations, and server-side rendering, delivering Lighthouse 100 across all Core Web Vitals.</w:t>
       </w:r>
     </w:p>
     <w:p>
@@ -110,7 +110,7 @@
     </w:p>
     <w:p>
       <w:r>
-        <w:t>The project adopts Document Authoring (DA) as the authoring interface:</w:t>
+        <w:t>The project adopts Document Authoring (DA) as the content management interface, replacing traditional AEM Touch UI with a streamlined, document-based authoring experience.</w:t>
       </w:r>
     </w:p>
     <w:p>
@@ -118,7 +118,7 @@
         <w:pStyle w:val="ListBullet"/>
       </w:pPr>
       <w:r>
-        <w:t>Authors work in a web-based document editor at da.live (similar to a simplified word processor)</w:t>
+        <w:t>Authors create and manage content through a web-based editor at da.live, offering a simplified word-processor-like experience with no component dialogs, JCR nodes, or Touch UI interactions.</w:t>
       </w:r>
     </w:p>
     <w:p>
@@ -126,7 +126,7 @@
         <w:pStyle w:val="ListBullet"/>
       </w:pPr>
       <w:r>
-        <w:t>Content is structured as text, tables, images, and links</w:t>
+        <w:t>Content is structured as text, headings, images, links, and block tables — where each table represents a component (block) with the header row identifying the block type and rows providing the content.</w:t>
       </w:r>
     </w:p>
     <w:p>
@@ -134,7 +134,7 @@
         <w:pStyle w:val="ListBullet"/>
       </w:pPr>
       <w:r>
-        <w:t>Blocks (components) are authored as tables — the table header names the block, rows contain the content</w:t>
+        <w:t>Block variants are specified inline using parentheses in the block name (e.g., Accordion (icon-left)), replacing the AEM Style System dropdown.</w:t>
       </w:r>
     </w:p>
     <w:p>
@@ -142,23 +142,7 @@
         <w:pStyle w:val="ListBullet"/>
       </w:pPr>
       <w:r>
-        <w:t>Variants are specified in the block name using parentheses, e.g., Accordion (icon-left)</w:t>
-      </w:r>
-    </w:p>
-    <w:p>
-      <w:pPr>
-        <w:pStyle w:val="ListBullet"/>
-      </w:pPr>
-      <w:r>
-        <w:t>Complex nested content is handled via the fragment reference pattern — linking to separate fragment pages</w:t>
-      </w:r>
-    </w:p>
-    <w:p>
-      <w:pPr>
-        <w:pStyle w:val="ListBullet"/>
-      </w:pPr>
-      <w:r>
-        <w:t>No component dialogs, no JCR, no Touch UI</w:t>
+        <w:t>Complex or nested content that cannot be represented within a single table cell is handled via the fragment reference pattern — authors link to separately authored fragment pages whose content is rendered inline at delivery time.</w:t>
       </w:r>
     </w:p>
     <w:p>
@@ -475,220 +459,90 @@
     </w:p>
     <w:p>
       <w:pPr>
-        <w:pStyle w:val="Heading2"/>
+        <w:pStyle w:val="ListBullet"/>
       </w:pPr>
       <w:r>
-        <w:t>2.1 Sites &amp; Content</w:t>
+        <w:t>Migration of thermofisher.com from on-premise AEM (hosted on AWS) to AEM Edge Delivery Services with Document Authoring (DA).</w:t>
       </w:r>
     </w:p>
-    <w:tbl>
-      <w:tblPr>
-        <w:tblStyle w:val="TableGrid"/>
-        <w:tblW w:type="auto" w:w="0"/>
-        <w:jc w:val="left"/>
-        <w:tblLook w:firstColumn="1" w:firstRow="1" w:lastColumn="0" w:lastRow="0" w:noHBand="0" w:noVBand="1" w:val="04A0"/>
-      </w:tblPr>
-      <w:tblGrid>
-        <w:gridCol w:w="4320"/>
-        <w:gridCol w:w="4320"/>
-      </w:tblGrid>
-      <w:tr>
-        <w:tc>
-          <w:tcPr>
-            <w:tcW w:type="dxa" w:w="2835"/>
-            <w:shd w:fill="2F5496"/>
-          </w:tcPr>
-          <w:p>
-            <w:r/>
-            <w:r>
-              <w:rPr>
-                <w:b/>
-                <w:color w:val="FFFFFF"/>
-                <w:sz w:val="20"/>
-              </w:rPr>
-              <w:t>Item</w:t>
-            </w:r>
-          </w:p>
-        </w:tc>
-        <w:tc>
-          <w:tcPr>
-            <w:tcW w:type="dxa" w:w="7370"/>
-            <w:shd w:fill="2F5496"/>
-          </w:tcPr>
-          <w:p>
-            <w:r/>
-            <w:r>
-              <w:rPr>
-                <w:b/>
-                <w:color w:val="FFFFFF"/>
-                <w:sz w:val="20"/>
-              </w:rPr>
-              <w:t>Description</w:t>
-            </w:r>
-          </w:p>
-        </w:tc>
-      </w:tr>
-      <w:tr>
-        <w:tc>
-          <w:tcPr>
-            <w:tcW w:type="dxa" w:w="2835"/>
-          </w:tcPr>
-          <w:p>
-            <w:r/>
-            <w:r>
-              <w:rPr>
-                <w:sz w:val="20"/>
-              </w:rPr>
-              <w:t>Region</w:t>
-            </w:r>
-          </w:p>
-        </w:tc>
-        <w:tc>
-          <w:tcPr>
-            <w:tcW w:type="dxa" w:w="7370"/>
-          </w:tcPr>
-          <w:p>
-            <w:r/>
-            <w:r>
-              <w:rPr>
-                <w:sz w:val="20"/>
-              </w:rPr>
-              <w:t>CUSA (US English site — thermofisher.com/us/en/)</w:t>
-            </w:r>
-          </w:p>
-        </w:tc>
-      </w:tr>
-      <w:tr>
-        <w:tc>
-          <w:tcPr>
-            <w:tcW w:type="dxa" w:w="2835"/>
-            <w:shd w:fill="D6DCE4"/>
-          </w:tcPr>
-          <w:p>
-            <w:r/>
-            <w:r>
-              <w:rPr>
-                <w:sz w:val="20"/>
-              </w:rPr>
-              <w:t>Page Types</w:t>
-            </w:r>
-          </w:p>
-        </w:tc>
-        <w:tc>
-          <w:tcPr>
-            <w:tcW w:type="dxa" w:w="7370"/>
-            <w:shd w:fill="D6DCE4"/>
-          </w:tcPr>
-          <w:p>
-            <w:r/>
-            <w:r>
-              <w:rPr>
-                <w:sz w:val="20"/>
-              </w:rPr>
-              <w:t>Explore/Landing Pages, PDP, Category, Resource/Education Pages</w:t>
-            </w:r>
-          </w:p>
-        </w:tc>
-      </w:tr>
-      <w:tr>
-        <w:tc>
-          <w:tcPr>
-            <w:tcW w:type="dxa" w:w="2835"/>
-          </w:tcPr>
-          <w:p>
-            <w:r/>
-            <w:r>
-              <w:rPr>
-                <w:sz w:val="20"/>
-              </w:rPr>
-              <w:t>Content Migration</w:t>
-            </w:r>
-          </w:p>
-        </w:tc>
-        <w:tc>
-          <w:tcPr>
-            <w:tcW w:type="dxa" w:w="7370"/>
-          </w:tcPr>
-          <w:p>
-            <w:r/>
-            <w:r>
-              <w:rPr>
-                <w:sz w:val="20"/>
-              </w:rPr>
-              <w:t>Phased migration of existing AEM 6.4 pages to EDS/DA</w:t>
-            </w:r>
-          </w:p>
-        </w:tc>
-      </w:tr>
-      <w:tr>
-        <w:tc>
-          <w:tcPr>
-            <w:tcW w:type="dxa" w:w="2835"/>
-            <w:shd w:fill="D6DCE4"/>
-          </w:tcPr>
-          <w:p>
-            <w:r/>
-            <w:r>
-              <w:rPr>
-                <w:sz w:val="20"/>
-              </w:rPr>
-              <w:t>Templates</w:t>
-            </w:r>
-          </w:p>
-        </w:tc>
-        <w:tc>
-          <w:tcPr>
-            <w:tcW w:type="dxa" w:w="7370"/>
-            <w:shd w:fill="D6DCE4"/>
-          </w:tcPr>
-          <w:p>
-            <w:r/>
-            <w:r>
-              <w:rPr>
-                <w:sz w:val="20"/>
-              </w:rPr>
-              <w:t>Page patterns via metadata, section structure, and implementation rules</w:t>
-            </w:r>
-          </w:p>
-        </w:tc>
-      </w:tr>
-      <w:tr>
-        <w:tc>
-          <w:tcPr>
-            <w:tcW w:type="dxa" w:w="2835"/>
-          </w:tcPr>
-          <w:p>
-            <w:r/>
-            <w:r>
-              <w:rPr>
-                <w:sz w:val="20"/>
-              </w:rPr>
-              <w:t>Navigation</w:t>
-            </w:r>
-          </w:p>
-        </w:tc>
-        <w:tc>
-          <w:tcPr>
-            <w:tcW w:type="dxa" w:w="7370"/>
-          </w:tcPr>
-          <w:p>
-            <w:r/>
-            <w:r>
-              <w:rPr>
-                <w:sz w:val="20"/>
-              </w:rPr>
-              <w:t>Header, Footer, Sub-navigation, Breadcrumb</w:t>
-            </w:r>
-          </w:p>
-        </w:tc>
-      </w:tr>
-    </w:tbl>
+    <w:p>
+      <w:pPr>
+        <w:pStyle w:val="ListBullet"/>
+      </w:pPr>
+      <w:r>
+        <w:t>DA authoring model design — block table structures, variant naming conventions, section patterns, and metadata standards.</w:t>
+      </w:r>
+    </w:p>
+    <w:p>
+      <w:pPr>
+        <w:pStyle w:val="ListBullet"/>
+      </w:pPr>
+      <w:r>
+        <w:t>AEM Cloud onboarding including IMS / Identity configuration.</w:t>
+      </w:r>
+    </w:p>
+    <w:p>
+      <w:pPr>
+        <w:pStyle w:val="ListBullet"/>
+      </w:pPr>
+      <w:r>
+        <w:t>User groups and permissions model for EDS and AEM Cloud authoring environments.</w:t>
+      </w:r>
+    </w:p>
+    <w:p>
+      <w:pPr>
+        <w:pStyle w:val="ListBullet"/>
+      </w:pPr>
+      <w:r>
+        <w:t>Integrations with dependent systems — Header/Footer, Brightcove (video), Dynamic Merchandising Offers, Form Submissions, and Data Layer (Analytics/Target).</w:t>
+      </w:r>
+    </w:p>
+    <w:p>
+      <w:pPr>
+        <w:pStyle w:val="ListBullet"/>
+      </w:pPr>
+      <w:r>
+        <w:t>Asset migration strategy and execution.</w:t>
+      </w:r>
+    </w:p>
+    <w:p>
+      <w:pPr>
+        <w:pStyle w:val="ListBullet"/>
+      </w:pPr>
+      <w:r>
+        <w:t>Current content workflows — review, approval, and publishing.</w:t>
+      </w:r>
+    </w:p>
+    <w:p>
+      <w:pPr>
+        <w:pStyle w:val="ListBullet"/>
+      </w:pPr>
+      <w:r>
+        <w:t>Third-party and extension integrations (e.g., Immersive Experience).</w:t>
+      </w:r>
+    </w:p>
+    <w:p>
+      <w:pPr>
+        <w:pStyle w:val="ListBullet"/>
+      </w:pPr>
+      <w:r>
+        <w:t>Vanity / friendly URL migration and redirect strategy.</w:t>
+      </w:r>
+    </w:p>
+    <w:p>
+      <w:pPr>
+        <w:pStyle w:val="ListBullet"/>
+      </w:pPr>
+      <w:r>
+        <w:t>MSM (Multi-Site Manager), translation, and rollout configuration for regional sites.</w:t>
+      </w:r>
+    </w:p>
     <w:p>
       <w:pPr>
         <w:pStyle w:val="Heading2"/>
       </w:pPr>
       <w:r>
-        <w:t>2.2 Block Library</w:t>
+        <w:t>2.1 Block Library</w:t>
       </w:r>
     </w:p>
     <w:tbl>
@@ -1040,7 +894,7 @@
               <w:rPr>
                 <w:sz w:val="20"/>
               </w:rPr>
-              <w:t>Anchor List</w:t>
+              <w:t>Columns</w:t>
             </w:r>
           </w:p>
         </w:tc>
@@ -1068,7 +922,7 @@
               <w:rPr>
                 <w:sz w:val="20"/>
               </w:rPr>
-              <w:t>In-page jump links</w:t>
+              <w:t>Multi-column layouts</w:t>
             </w:r>
           </w:p>
         </w:tc>
@@ -1085,98 +939,7 @@
               <w:rPr>
                 <w:sz w:val="20"/>
               </w:rPr>
-              <w:t>Columns</w:t>
-            </w:r>
-          </w:p>
-        </w:tc>
-        <w:tc>
-          <w:tcPr>
-            <w:tcW w:type="dxa" w:w="1701"/>
-            <w:shd w:fill="D6DCE4"/>
-          </w:tcPr>
-          <w:p>
-            <w:r/>
-            <w:r>
-              <w:rPr>
-                <w:sz w:val="20"/>
-              </w:rPr>
-              <w:t>Low</w:t>
-            </w:r>
-          </w:p>
-        </w:tc>
-        <w:tc>
-          <w:tcPr>
-            <w:tcW w:type="dxa" w:w="5669"/>
-            <w:shd w:fill="D6DCE4"/>
-          </w:tcPr>
-          <w:p>
-            <w:r/>
-            <w:r>
-              <w:rPr>
-                <w:sz w:val="20"/>
-              </w:rPr>
-              <w:t>Multi-column layouts</w:t>
-            </w:r>
-          </w:p>
-        </w:tc>
-      </w:tr>
-      <w:tr>
-        <w:tc>
-          <w:tcPr>
-            <w:tcW w:type="dxa" w:w="2835"/>
-          </w:tcPr>
-          <w:p>
-            <w:r/>
-            <w:r>
-              <w:rPr>
-                <w:sz w:val="20"/>
-              </w:rPr>
               <w:t>Custom Table</w:t>
-            </w:r>
-          </w:p>
-        </w:tc>
-        <w:tc>
-          <w:tcPr>
-            <w:tcW w:type="dxa" w:w="1701"/>
-          </w:tcPr>
-          <w:p>
-            <w:r/>
-            <w:r>
-              <w:rPr>
-                <w:sz w:val="20"/>
-              </w:rPr>
-              <w:t>Medium</w:t>
-            </w:r>
-          </w:p>
-        </w:tc>
-        <w:tc>
-          <w:tcPr>
-            <w:tcW w:type="dxa" w:w="5669"/>
-          </w:tcPr>
-          <w:p>
-            <w:r/>
-            <w:r>
-              <w:rPr>
-                <w:sz w:val="20"/>
-              </w:rPr>
-              <w:t>Styled data tables</w:t>
-            </w:r>
-          </w:p>
-        </w:tc>
-      </w:tr>
-      <w:tr>
-        <w:tc>
-          <w:tcPr>
-            <w:tcW w:type="dxa" w:w="2835"/>
-            <w:shd w:fill="D6DCE4"/>
-          </w:tcPr>
-          <w:p>
-            <w:r/>
-            <w:r>
-              <w:rPr>
-                <w:sz w:val="20"/>
-              </w:rPr>
-              <w:t>Sub Navigation</w:t>
             </w:r>
           </w:p>
         </w:tc>
@@ -1206,7 +969,7 @@
               <w:rPr>
                 <w:sz w:val="20"/>
               </w:rPr>
-              <w:t>Section-level navigation</w:t>
+              <w:t>Styled data tables</w:t>
             </w:r>
           </w:p>
         </w:tc>
@@ -1222,7 +985,7 @@
               <w:rPr>
                 <w:sz w:val="20"/>
               </w:rPr>
-              <w:t>Basic Table</w:t>
+              <w:t>Sub Navigation</w:t>
             </w:r>
           </w:p>
         </w:tc>
@@ -1236,7 +999,7 @@
               <w:rPr>
                 <w:sz w:val="20"/>
               </w:rPr>
-              <w:t>Low</w:t>
+              <w:t>Medium</w:t>
             </w:r>
           </w:p>
         </w:tc>
@@ -1250,7 +1013,7 @@
               <w:rPr>
                 <w:sz w:val="20"/>
               </w:rPr>
-              <w:t>Simple HTML tables</w:t>
+              <w:t>Section-level navigation</w:t>
             </w:r>
           </w:p>
         </w:tc>
@@ -1804,1096 +1567,28 @@
     </w:tbl>
     <w:p>
       <w:pPr>
-        <w:pStyle w:val="Heading2"/>
-      </w:pPr>
-      <w:r>
-        <w:t>2.3 Forms</w:t>
-      </w:r>
-    </w:p>
-    <w:tbl>
-      <w:tblPr>
-        <w:tblStyle w:val="TableGrid"/>
-        <w:tblW w:type="auto" w:w="0"/>
-        <w:jc w:val="left"/>
-        <w:tblLook w:firstColumn="1" w:firstRow="1" w:lastColumn="0" w:lastRow="0" w:noHBand="0" w:noVBand="1" w:val="04A0"/>
-      </w:tblPr>
-      <w:tblGrid>
-        <w:gridCol w:w="4320"/>
-        <w:gridCol w:w="4320"/>
-      </w:tblGrid>
-      <w:tr>
-        <w:tc>
-          <w:tcPr>
-            <w:tcW w:type="dxa" w:w="3402"/>
-            <w:shd w:fill="2F5496"/>
-          </w:tcPr>
-          <w:p>
-            <w:r/>
-            <w:r>
-              <w:rPr>
-                <w:b/>
-                <w:color w:val="FFFFFF"/>
-                <w:sz w:val="20"/>
-              </w:rPr>
-              <w:t>Item</w:t>
-            </w:r>
-          </w:p>
-        </w:tc>
-        <w:tc>
-          <w:tcPr>
-            <w:tcW w:type="dxa" w:w="6803"/>
-            <w:shd w:fill="2F5496"/>
-          </w:tcPr>
-          <w:p>
-            <w:r/>
-            <w:r>
-              <w:rPr>
-                <w:b/>
-                <w:color w:val="FFFFFF"/>
-                <w:sz w:val="20"/>
-              </w:rPr>
-              <w:t>Description</w:t>
-            </w:r>
-          </w:p>
-        </w:tc>
-      </w:tr>
-      <w:tr>
-        <w:tc>
-          <w:tcPr>
-            <w:tcW w:type="dxa" w:w="3402"/>
-          </w:tcPr>
-          <w:p>
-            <w:r/>
-            <w:r>
-              <w:rPr>
-                <w:sz w:val="20"/>
-              </w:rPr>
-              <w:t>Form Authoring in DA/EDS</w:t>
-            </w:r>
-          </w:p>
-        </w:tc>
-        <w:tc>
-          <w:tcPr>
-            <w:tcW w:type="dxa" w:w="6803"/>
-          </w:tcPr>
-          <w:p>
-            <w:r/>
-            <w:r>
-              <w:rPr>
-                <w:sz w:val="20"/>
-              </w:rPr>
-              <w:t>EDS-native form blocks with spreadsheet-based field definitions</w:t>
-            </w:r>
-          </w:p>
-        </w:tc>
-      </w:tr>
-      <w:tr>
-        <w:tc>
-          <w:tcPr>
-            <w:tcW w:type="dxa" w:w="3402"/>
-            <w:shd w:fill="D6DCE4"/>
-          </w:tcPr>
-          <w:p>
-            <w:r/>
-            <w:r>
-              <w:rPr>
-                <w:sz w:val="20"/>
-              </w:rPr>
-              <w:t>Rule Editor &amp; Validations</w:t>
-            </w:r>
-          </w:p>
-        </w:tc>
-        <w:tc>
-          <w:tcPr>
-            <w:tcW w:type="dxa" w:w="6803"/>
-            <w:shd w:fill="D6DCE4"/>
-          </w:tcPr>
-          <w:p>
-            <w:r/>
-            <w:r>
-              <w:rPr>
-                <w:sz w:val="20"/>
-              </w:rPr>
-              <w:t>Conditional logic, field validations, show/hide rules</w:t>
-            </w:r>
-          </w:p>
-        </w:tc>
-      </w:tr>
-      <w:tr>
-        <w:tc>
-          <w:tcPr>
-            <w:tcW w:type="dxa" w:w="3402"/>
-          </w:tcPr>
-          <w:p>
-            <w:r/>
-            <w:r>
-              <w:rPr>
-                <w:sz w:val="20"/>
-              </w:rPr>
-              <w:t>Request a Quote</w:t>
-            </w:r>
-          </w:p>
-        </w:tc>
-        <w:tc>
-          <w:tcPr>
-            <w:tcW w:type="dxa" w:w="6803"/>
-          </w:tcPr>
-          <w:p>
-            <w:r/>
-            <w:r>
-              <w:rPr>
-                <w:sz w:val="20"/>
-              </w:rPr>
-              <w:t>Complex multi-step form with dynamic fields</w:t>
-            </w:r>
-          </w:p>
-        </w:tc>
-      </w:tr>
-      <w:tr>
-        <w:tc>
-          <w:tcPr>
-            <w:tcW w:type="dxa" w:w="3402"/>
-            <w:shd w:fill="D6DCE4"/>
-          </w:tcPr>
-          <w:p>
-            <w:r/>
-            <w:r>
-              <w:rPr>
-                <w:sz w:val="20"/>
-              </w:rPr>
-              <w:t>Dynamic Dropdown / Cascading</w:t>
-            </w:r>
-          </w:p>
-        </w:tc>
-        <w:tc>
-          <w:tcPr>
-            <w:tcW w:type="dxa" w:w="6803"/>
-            <w:shd w:fill="D6DCE4"/>
-          </w:tcPr>
-          <w:p>
-            <w:r/>
-            <w:r>
-              <w:rPr>
-                <w:sz w:val="20"/>
-              </w:rPr>
-              <w:t>API-driven dependent dropdowns</w:t>
-            </w:r>
-          </w:p>
-        </w:tc>
-      </w:tr>
-      <w:tr>
-        <w:tc>
-          <w:tcPr>
-            <w:tcW w:type="dxa" w:w="3402"/>
-          </w:tcPr>
-          <w:p>
-            <w:r/>
-            <w:r>
-              <w:rPr>
-                <w:sz w:val="20"/>
-              </w:rPr>
-              <w:t>reCAPTCHA</w:t>
-            </w:r>
-          </w:p>
-        </w:tc>
-        <w:tc>
-          <w:tcPr>
-            <w:tcW w:type="dxa" w:w="6803"/>
-          </w:tcPr>
-          <w:p>
-            <w:r/>
-            <w:r>
-              <w:rPr>
-                <w:sz w:val="20"/>
-              </w:rPr>
-              <w:t>Bot protection integration</w:t>
-            </w:r>
-          </w:p>
-        </w:tc>
-      </w:tr>
-      <w:tr>
-        <w:tc>
-          <w:tcPr>
-            <w:tcW w:type="dxa" w:w="3402"/>
-            <w:shd w:fill="D6DCE4"/>
-          </w:tcPr>
-          <w:p>
-            <w:r/>
-            <w:r>
-              <w:rPr>
-                <w:sz w:val="20"/>
-              </w:rPr>
-              <w:t>Rendering &amp; Submission</w:t>
-            </w:r>
-          </w:p>
-        </w:tc>
-        <w:tc>
-          <w:tcPr>
-            <w:tcW w:type="dxa" w:w="6803"/>
-            <w:shd w:fill="D6DCE4"/>
-          </w:tcPr>
-          <w:p>
-            <w:r/>
-            <w:r>
-              <w:rPr>
-                <w:sz w:val="20"/>
-              </w:rPr>
-              <w:t>Client-side rendering, server-side submission, document upload</w:t>
-            </w:r>
-          </w:p>
-        </w:tc>
-      </w:tr>
-    </w:tbl>
-    <w:p>
-      <w:pPr>
-        <w:pStyle w:val="Heading2"/>
-      </w:pPr>
-      <w:r>
-        <w:t>2.4 Integrations</w:t>
-      </w:r>
-    </w:p>
-    <w:tbl>
-      <w:tblPr>
-        <w:tblStyle w:val="TableGrid"/>
-        <w:tblW w:type="auto" w:w="0"/>
-        <w:jc w:val="left"/>
-        <w:tblLook w:firstColumn="1" w:firstRow="1" w:lastColumn="0" w:lastRow="0" w:noHBand="0" w:noVBand="1" w:val="04A0"/>
-      </w:tblPr>
-      <w:tblGrid>
-        <w:gridCol w:w="4320"/>
-        <w:gridCol w:w="4320"/>
-      </w:tblGrid>
-      <w:tr>
-        <w:tc>
-          <w:tcPr>
-            <w:tcW w:type="dxa" w:w="3402"/>
-            <w:shd w:fill="2F5496"/>
-          </w:tcPr>
-          <w:p>
-            <w:r/>
-            <w:r>
-              <w:rPr>
-                <w:b/>
-                <w:color w:val="FFFFFF"/>
-                <w:sz w:val="20"/>
-              </w:rPr>
-              <w:t>Integration</w:t>
-            </w:r>
-          </w:p>
-        </w:tc>
-        <w:tc>
-          <w:tcPr>
-            <w:tcW w:type="dxa" w:w="6803"/>
-            <w:shd w:fill="2F5496"/>
-          </w:tcPr>
-          <w:p>
-            <w:r/>
-            <w:r>
-              <w:rPr>
-                <w:b/>
-                <w:color w:val="FFFFFF"/>
-                <w:sz w:val="20"/>
-              </w:rPr>
-              <w:t>Description</w:t>
-            </w:r>
-          </w:p>
-        </w:tc>
-      </w:tr>
-      <w:tr>
-        <w:tc>
-          <w:tcPr>
-            <w:tcW w:type="dxa" w:w="3402"/>
-          </w:tcPr>
-          <w:p>
-            <w:r/>
-            <w:r>
-              <w:rPr>
-                <w:sz w:val="20"/>
-              </w:rPr>
-              <w:t>Content Syndication — PDP</w:t>
-            </w:r>
-          </w:p>
-        </w:tc>
-        <w:tc>
-          <w:tcPr>
-            <w:tcW w:type="dxa" w:w="6803"/>
-          </w:tcPr>
-          <w:p>
-            <w:r/>
-            <w:r>
-              <w:rPr>
-                <w:sz w:val="20"/>
-              </w:rPr>
-              <w:t>Product data integration with Product Detail Pages</w:t>
-            </w:r>
-          </w:p>
-        </w:tc>
-      </w:tr>
-      <w:tr>
-        <w:tc>
-          <w:tcPr>
-            <w:tcW w:type="dxa" w:w="3402"/>
-            <w:shd w:fill="D6DCE4"/>
-          </w:tcPr>
-          <w:p>
-            <w:r/>
-            <w:r>
-              <w:rPr>
-                <w:sz w:val="20"/>
-              </w:rPr>
-              <w:t>Brightcove</w:t>
-            </w:r>
-          </w:p>
-        </w:tc>
-        <w:tc>
-          <w:tcPr>
-            <w:tcW w:type="dxa" w:w="6803"/>
-            <w:shd w:fill="D6DCE4"/>
-          </w:tcPr>
-          <w:p>
-            <w:r/>
-            <w:r>
-              <w:rPr>
-                <w:sz w:val="20"/>
-              </w:rPr>
-              <w:t>Video hosting and streaming integration</w:t>
-            </w:r>
-          </w:p>
-        </w:tc>
-      </w:tr>
-      <w:tr>
-        <w:tc>
-          <w:tcPr>
-            <w:tcW w:type="dxa" w:w="3402"/>
-          </w:tcPr>
-          <w:p>
-            <w:r/>
-            <w:r>
-              <w:rPr>
-                <w:sz w:val="20"/>
-              </w:rPr>
-              <w:t>Data Layer &amp; Analytics</w:t>
-            </w:r>
-          </w:p>
-        </w:tc>
-        <w:tc>
-          <w:tcPr>
-            <w:tcW w:type="dxa" w:w="6803"/>
-          </w:tcPr>
-          <w:p>
-            <w:r/>
-            <w:r>
-              <w:rPr>
-                <w:sz w:val="20"/>
-              </w:rPr>
-              <w:t>Adobe Analytics / Adobe Target integration</w:t>
-            </w:r>
-          </w:p>
-        </w:tc>
-      </w:tr>
-      <w:tr>
-        <w:tc>
-          <w:tcPr>
-            <w:tcW w:type="dxa" w:w="3402"/>
-            <w:shd w:fill="D6DCE4"/>
-          </w:tcPr>
-          <w:p>
-            <w:r/>
-            <w:r>
-              <w:rPr>
-                <w:sz w:val="20"/>
-              </w:rPr>
-              <w:t>Forms Backend</w:t>
-            </w:r>
-          </w:p>
-        </w:tc>
-        <w:tc>
-          <w:tcPr>
-            <w:tcW w:type="dxa" w:w="6803"/>
-            <w:shd w:fill="D6DCE4"/>
-          </w:tcPr>
-          <w:p>
-            <w:r/>
-            <w:r>
-              <w:rPr>
-                <w:sz w:val="20"/>
-              </w:rPr>
-              <w:t>Form submission endpoints and processing</w:t>
-            </w:r>
-          </w:p>
-        </w:tc>
-      </w:tr>
-    </w:tbl>
-    <w:p>
-      <w:pPr>
-        <w:pStyle w:val="Heading2"/>
-      </w:pPr>
-      <w:r>
-        <w:t>2.5 Non-Functional Requirements</w:t>
-      </w:r>
-    </w:p>
-    <w:tbl>
-      <w:tblPr>
-        <w:tblStyle w:val="TableGrid"/>
-        <w:tblW w:type="auto" w:w="0"/>
-        <w:jc w:val="left"/>
-        <w:tblLook w:firstColumn="1" w:firstRow="1" w:lastColumn="0" w:lastRow="0" w:noHBand="0" w:noVBand="1" w:val="04A0"/>
-      </w:tblPr>
-      <w:tblGrid>
-        <w:gridCol w:w="4320"/>
-        <w:gridCol w:w="4320"/>
-      </w:tblGrid>
-      <w:tr>
-        <w:tc>
-          <w:tcPr>
-            <w:tcW w:type="dxa" w:w="2835"/>
-            <w:shd w:fill="2F5496"/>
-          </w:tcPr>
-          <w:p>
-            <w:r/>
-            <w:r>
-              <w:rPr>
-                <w:b/>
-                <w:color w:val="FFFFFF"/>
-                <w:sz w:val="20"/>
-              </w:rPr>
-              <w:t>Area</w:t>
-            </w:r>
-          </w:p>
-        </w:tc>
-        <w:tc>
-          <w:tcPr>
-            <w:tcW w:type="dxa" w:w="7370"/>
-            <w:shd w:fill="2F5496"/>
-          </w:tcPr>
-          <w:p>
-            <w:r/>
-            <w:r>
-              <w:rPr>
-                <w:b/>
-                <w:color w:val="FFFFFF"/>
-                <w:sz w:val="20"/>
-              </w:rPr>
-              <w:t>Description</w:t>
-            </w:r>
-          </w:p>
-        </w:tc>
-      </w:tr>
-      <w:tr>
-        <w:tc>
-          <w:tcPr>
-            <w:tcW w:type="dxa" w:w="2835"/>
-          </w:tcPr>
-          <w:p>
-            <w:r/>
-            <w:r>
-              <w:rPr>
-                <w:sz w:val="20"/>
-              </w:rPr>
-              <w:t>SEO</w:t>
-            </w:r>
-          </w:p>
-        </w:tc>
-        <w:tc>
-          <w:tcPr>
-            <w:tcW w:type="dxa" w:w="7370"/>
-          </w:tcPr>
-          <w:p>
-            <w:r/>
-            <w:r>
-              <w:rPr>
-                <w:sz w:val="20"/>
-              </w:rPr>
-              <w:t>Web Vitals optimization, structured data, redirect management</w:t>
-            </w:r>
-          </w:p>
-        </w:tc>
-      </w:tr>
-      <w:tr>
-        <w:tc>
-          <w:tcPr>
-            <w:tcW w:type="dxa" w:w="2835"/>
-            <w:shd w:fill="D6DCE4"/>
-          </w:tcPr>
-          <w:p>
-            <w:r/>
-            <w:r>
-              <w:rPr>
-                <w:sz w:val="20"/>
-              </w:rPr>
-              <w:t>Performance</w:t>
-            </w:r>
-          </w:p>
-        </w:tc>
-        <w:tc>
-          <w:tcPr>
-            <w:tcW w:type="dxa" w:w="7370"/>
-            <w:shd w:fill="D6DCE4"/>
-          </w:tcPr>
-          <w:p>
-            <w:r/>
-            <w:r>
-              <w:rPr>
-                <w:sz w:val="20"/>
-              </w:rPr>
-              <w:t>Lighthouse 100; LCP &lt; 2.5s, CLS &lt; 0.1, INP &lt; 200ms</w:t>
-            </w:r>
-          </w:p>
-        </w:tc>
-      </w:tr>
-      <w:tr>
-        <w:tc>
-          <w:tcPr>
-            <w:tcW w:type="dxa" w:w="2835"/>
-          </w:tcPr>
-          <w:p>
-            <w:r/>
-            <w:r>
-              <w:rPr>
-                <w:sz w:val="20"/>
-              </w:rPr>
-              <w:t>Accessibility</w:t>
-            </w:r>
-          </w:p>
-        </w:tc>
-        <w:tc>
-          <w:tcPr>
-            <w:tcW w:type="dxa" w:w="7370"/>
-          </w:tcPr>
-          <w:p>
-            <w:r/>
-            <w:r>
-              <w:rPr>
-                <w:sz w:val="20"/>
-              </w:rPr>
-              <w:t>WCAG 2.1 AA compliance</w:t>
-            </w:r>
-          </w:p>
-        </w:tc>
-      </w:tr>
-      <w:tr>
-        <w:tc>
-          <w:tcPr>
-            <w:tcW w:type="dxa" w:w="2835"/>
-            <w:shd w:fill="D6DCE4"/>
-          </w:tcPr>
-          <w:p>
-            <w:r/>
-            <w:r>
-              <w:rPr>
-                <w:sz w:val="20"/>
-              </w:rPr>
-              <w:t>Browsers</w:t>
-            </w:r>
-          </w:p>
-        </w:tc>
-        <w:tc>
-          <w:tcPr>
-            <w:tcW w:type="dxa" w:w="7370"/>
-            <w:shd w:fill="D6DCE4"/>
-          </w:tcPr>
-          <w:p>
-            <w:r/>
-            <w:r>
-              <w:rPr>
-                <w:sz w:val="20"/>
-              </w:rPr>
-              <w:t>Latest Chrome, Edge, Safari, Firefox (no IE)</w:t>
-            </w:r>
-          </w:p>
-        </w:tc>
-      </w:tr>
-      <w:tr>
-        <w:tc>
-          <w:tcPr>
-            <w:tcW w:type="dxa" w:w="2835"/>
-          </w:tcPr>
-          <w:p>
-            <w:r/>
-            <w:r>
-              <w:rPr>
-                <w:sz w:val="20"/>
-              </w:rPr>
-              <w:t>Devices</w:t>
-            </w:r>
-          </w:p>
-        </w:tc>
-        <w:tc>
-          <w:tcPr>
-            <w:tcW w:type="dxa" w:w="7370"/>
-          </w:tcPr>
-          <w:p>
-            <w:r/>
-            <w:r>
-              <w:rPr>
-                <w:sz w:val="20"/>
-              </w:rPr>
-              <w:t>Mobile, Tablet, Desktop</w:t>
-            </w:r>
-          </w:p>
-        </w:tc>
-      </w:tr>
-      <w:tr>
-        <w:tc>
-          <w:tcPr>
-            <w:tcW w:type="dxa" w:w="2835"/>
-            <w:shd w:fill="D6DCE4"/>
-          </w:tcPr>
-          <w:p>
-            <w:r/>
-            <w:r>
-              <w:rPr>
-                <w:sz w:val="20"/>
-              </w:rPr>
-              <w:t>Viewports</w:t>
-            </w:r>
-          </w:p>
-        </w:tc>
-        <w:tc>
-          <w:tcPr>
-            <w:tcW w:type="dxa" w:w="7370"/>
-            <w:shd w:fill="D6DCE4"/>
-          </w:tcPr>
-          <w:p>
-            <w:r/>
-            <w:r>
-              <w:rPr>
-                <w:sz w:val="20"/>
-              </w:rPr>
-              <w:t>Mobile (&lt;768px), Tablet (768–1199px), Desktop (&gt;=1200px)</w:t>
-            </w:r>
-          </w:p>
-        </w:tc>
-      </w:tr>
-    </w:tbl>
-    <w:p>
-      <w:pPr>
         <w:pStyle w:val="Heading1"/>
       </w:pPr>
       <w:r>
         <w:t>3. Out of Scope</w:t>
       </w:r>
     </w:p>
-    <w:tbl>
-      <w:tblPr>
-        <w:tblStyle w:val="TableGrid"/>
-        <w:tblW w:type="auto" w:w="0"/>
-        <w:jc w:val="left"/>
-        <w:tblLook w:firstColumn="1" w:firstRow="1" w:lastColumn="0" w:lastRow="0" w:noHBand="0" w:noVBand="1" w:val="04A0"/>
-      </w:tblPr>
-      <w:tblGrid>
-        <w:gridCol w:w="4320"/>
-        <w:gridCol w:w="4320"/>
-      </w:tblGrid>
-      <w:tr>
-        <w:tc>
-          <w:tcPr>
-            <w:tcW w:type="dxa" w:w="3402"/>
-            <w:shd w:fill="2F5496"/>
-          </w:tcPr>
-          <w:p>
-            <w:r/>
-            <w:r>
-              <w:rPr>
-                <w:b/>
-                <w:color w:val="FFFFFF"/>
-                <w:sz w:val="20"/>
-              </w:rPr>
-              <w:t>Item</w:t>
-            </w:r>
-          </w:p>
-        </w:tc>
-        <w:tc>
-          <w:tcPr>
-            <w:tcW w:type="dxa" w:w="6803"/>
-            <w:shd w:fill="2F5496"/>
-          </w:tcPr>
-          <w:p>
-            <w:r/>
-            <w:r>
-              <w:rPr>
-                <w:b/>
-                <w:color w:val="FFFFFF"/>
-                <w:sz w:val="20"/>
-              </w:rPr>
-              <w:t>Rationale</w:t>
-            </w:r>
-          </w:p>
-        </w:tc>
-      </w:tr>
-      <w:tr>
-        <w:tc>
-          <w:tcPr>
-            <w:tcW w:type="dxa" w:w="3402"/>
-          </w:tcPr>
-          <w:p>
-            <w:r/>
-            <w:r>
-              <w:rPr>
-                <w:sz w:val="20"/>
-              </w:rPr>
-              <w:t>MSM / Multi-Site Manager</w:t>
-            </w:r>
-          </w:p>
-        </w:tc>
-        <w:tc>
-          <w:tcPr>
-            <w:tcW w:type="dxa" w:w="6803"/>
-          </w:tcPr>
-          <w:p>
-            <w:r/>
-            <w:r>
-              <w:rPr>
-                <w:sz w:val="20"/>
-              </w:rPr>
-              <w:t>Not addressed in this phase; multi-region management handled separately</w:t>
-            </w:r>
-          </w:p>
-        </w:tc>
-      </w:tr>
-      <w:tr>
-        <w:tc>
-          <w:tcPr>
-            <w:tcW w:type="dxa" w:w="3402"/>
-            <w:shd w:fill="D6DCE4"/>
-          </w:tcPr>
-          <w:p>
-            <w:r/>
-            <w:r>
-              <w:rPr>
-                <w:sz w:val="20"/>
-              </w:rPr>
-              <w:t>Translations / i18n</w:t>
-            </w:r>
-          </w:p>
-        </w:tc>
-        <w:tc>
-          <w:tcPr>
-            <w:tcW w:type="dxa" w:w="6803"/>
-            <w:shd w:fill="D6DCE4"/>
-          </w:tcPr>
-          <w:p>
-            <w:r/>
-            <w:r>
-              <w:rPr>
-                <w:sz w:val="20"/>
-              </w:rPr>
-              <w:t>Language variants outside CUSA region not in scope</w:t>
-            </w:r>
-          </w:p>
-        </w:tc>
-      </w:tr>
-      <w:tr>
-        <w:tc>
-          <w:tcPr>
-            <w:tcW w:type="dxa" w:w="3402"/>
-          </w:tcPr>
-          <w:p>
-            <w:r/>
-            <w:r>
-              <w:rPr>
-                <w:sz w:val="20"/>
-              </w:rPr>
-              <w:t>Experience Fragments migration</w:t>
-            </w:r>
-          </w:p>
-        </w:tc>
-        <w:tc>
-          <w:tcPr>
-            <w:tcW w:type="dxa" w:w="6803"/>
-          </w:tcPr>
-          <w:p>
-            <w:r/>
-            <w:r>
-              <w:rPr>
-                <w:sz w:val="20"/>
-              </w:rPr>
-              <w:t>Replaced by DA fragment reference pattern</w:t>
-            </w:r>
-          </w:p>
-        </w:tc>
-      </w:tr>
-      <w:tr>
-        <w:tc>
-          <w:tcPr>
-            <w:tcW w:type="dxa" w:w="3402"/>
-            <w:shd w:fill="D6DCE4"/>
-          </w:tcPr>
-          <w:p>
-            <w:r/>
-            <w:r>
-              <w:rPr>
-                <w:sz w:val="20"/>
-              </w:rPr>
-              <w:t>AEM Assets migration</w:t>
-            </w:r>
-          </w:p>
-        </w:tc>
-        <w:tc>
-          <w:tcPr>
-            <w:tcW w:type="dxa" w:w="6803"/>
-            <w:shd w:fill="D6DCE4"/>
-          </w:tcPr>
-          <w:p>
-            <w:r/>
-            <w:r>
-              <w:rPr>
-                <w:sz w:val="20"/>
-              </w:rPr>
-              <w:t>Enterprise DAM strategy handled separately</w:t>
-            </w:r>
-          </w:p>
-        </w:tc>
-      </w:tr>
-      <w:tr>
-        <w:tc>
-          <w:tcPr>
-            <w:tcW w:type="dxa" w:w="3402"/>
-          </w:tcPr>
-          <w:p>
-            <w:r/>
-            <w:r>
-              <w:rPr>
-                <w:sz w:val="20"/>
-              </w:rPr>
-              <w:t>Workflows</w:t>
-            </w:r>
-          </w:p>
-        </w:tc>
-        <w:tc>
-          <w:tcPr>
-            <w:tcW w:type="dxa" w:w="6803"/>
-          </w:tcPr>
-          <w:p>
-            <w:r/>
-            <w:r>
-              <w:rPr>
-                <w:sz w:val="20"/>
-              </w:rPr>
-              <w:t>Content approval workflows deferred to later phase</w:t>
-            </w:r>
-          </w:p>
-        </w:tc>
-      </w:tr>
-      <w:tr>
-        <w:tc>
-          <w:tcPr>
-            <w:tcW w:type="dxa" w:w="3402"/>
-            <w:shd w:fill="D6DCE4"/>
-          </w:tcPr>
-          <w:p>
-            <w:r/>
-            <w:r>
-              <w:rPr>
-                <w:sz w:val="20"/>
-              </w:rPr>
-              <w:t>User Groups &amp; Permissions</w:t>
-            </w:r>
-          </w:p>
-        </w:tc>
-        <w:tc>
-          <w:tcPr>
-            <w:tcW w:type="dxa" w:w="6803"/>
-            <w:shd w:fill="D6DCE4"/>
-          </w:tcPr>
-          <w:p>
-            <w:r/>
-            <w:r>
-              <w:rPr>
-                <w:sz w:val="20"/>
-              </w:rPr>
-              <w:t>Permission model acknowledged but not fully detailed</w:t>
-            </w:r>
-          </w:p>
-        </w:tc>
-      </w:tr>
-      <w:tr>
-        <w:tc>
-          <w:tcPr>
-            <w:tcW w:type="dxa" w:w="3402"/>
-          </w:tcPr>
-          <w:p>
-            <w:r/>
-            <w:r>
-              <w:rPr>
-                <w:sz w:val="20"/>
-              </w:rPr>
-              <w:t>Internet Explorer support</w:t>
-            </w:r>
-          </w:p>
-        </w:tc>
-        <w:tc>
-          <w:tcPr>
-            <w:tcW w:type="dxa" w:w="6803"/>
-          </w:tcPr>
-          <w:p>
-            <w:r/>
-            <w:r>
-              <w:rPr>
-                <w:sz w:val="20"/>
-              </w:rPr>
-              <w:t>IE is end-of-life and not supported</w:t>
-            </w:r>
-          </w:p>
-        </w:tc>
-      </w:tr>
-      <w:tr>
-        <w:tc>
-          <w:tcPr>
-            <w:tcW w:type="dxa" w:w="3402"/>
-            <w:shd w:fill="D6DCE4"/>
-          </w:tcPr>
-          <w:p>
-            <w:r/>
-            <w:r>
-              <w:rPr>
-                <w:sz w:val="20"/>
-              </w:rPr>
-              <w:t>Non-US regions (CCI, CBR, LATAM, EMEA)</w:t>
-            </w:r>
-          </w:p>
-        </w:tc>
-        <w:tc>
-          <w:tcPr>
-            <w:tcW w:type="dxa" w:w="6803"/>
-            <w:shd w:fill="D6DCE4"/>
-          </w:tcPr>
-          <w:p>
-            <w:r/>
-            <w:r>
-              <w:rPr>
-                <w:sz w:val="20"/>
-              </w:rPr>
-              <w:t>Subsequent phases</w:t>
-            </w:r>
-          </w:p>
-        </w:tc>
-      </w:tr>
-      <w:tr>
-        <w:tc>
-          <w:tcPr>
-            <w:tcW w:type="dxa" w:w="3402"/>
-          </w:tcPr>
-          <w:p>
-            <w:r/>
-            <w:r>
-              <w:rPr>
-                <w:sz w:val="20"/>
-              </w:rPr>
-              <w:t>AEM as a Cloud Service migration</w:t>
-            </w:r>
-          </w:p>
-        </w:tc>
-        <w:tc>
-          <w:tcPr>
-            <w:tcW w:type="dxa" w:w="6803"/>
-          </w:tcPr>
-          <w:p>
-            <w:r/>
-            <w:r>
-              <w:rPr>
-                <w:sz w:val="20"/>
-              </w:rPr>
-              <w:t>Project targets EDS/DA, not AEMaaCS Author</w:t>
-            </w:r>
-          </w:p>
-        </w:tc>
-      </w:tr>
-      <w:tr>
-        <w:tc>
-          <w:tcPr>
-            <w:tcW w:type="dxa" w:w="3402"/>
-            <w:shd w:fill="D6DCE4"/>
-          </w:tcPr>
-          <w:p>
-            <w:r/>
-            <w:r>
-              <w:rPr>
-                <w:sz w:val="20"/>
-              </w:rPr>
-              <w:t>Custom search implementation</w:t>
-            </w:r>
-          </w:p>
-        </w:tc>
-        <w:tc>
-          <w:tcPr>
-            <w:tcW w:type="dxa" w:w="6803"/>
-            <w:shd w:fill="D6DCE4"/>
-          </w:tcPr>
-          <w:p>
-            <w:r/>
-            <w:r>
-              <w:rPr>
-                <w:sz w:val="20"/>
-              </w:rPr>
-              <w:t>Relies on existing infrastructure or third-party</w:t>
-            </w:r>
-          </w:p>
-        </w:tc>
-      </w:tr>
-      <w:tr>
-        <w:tc>
-          <w:tcPr>
-            <w:tcW w:type="dxa" w:w="3402"/>
-          </w:tcPr>
-          <w:p>
-            <w:r/>
-            <w:r>
-              <w:rPr>
-                <w:sz w:val="20"/>
-              </w:rPr>
-              <w:t>E-commerce / cart integration</w:t>
-            </w:r>
-          </w:p>
-        </w:tc>
-        <w:tc>
-          <w:tcPr>
-            <w:tcW w:type="dxa" w:w="6803"/>
-          </w:tcPr>
-          <w:p>
-            <w:r/>
-            <w:r>
-              <w:rPr>
-                <w:sz w:val="20"/>
-              </w:rPr>
-              <w:t>Store/transactional features outside scope</w:t>
-            </w:r>
-          </w:p>
-        </w:tc>
-      </w:tr>
-      <w:tr>
-        <w:tc>
-          <w:tcPr>
-            <w:tcW w:type="dxa" w:w="3402"/>
-            <w:shd w:fill="D6DCE4"/>
-          </w:tcPr>
-          <w:p>
-            <w:r/>
-            <w:r>
-              <w:rPr>
-                <w:sz w:val="20"/>
-              </w:rPr>
-              <w:t>Cutover &amp; coexistence strategy</w:t>
-            </w:r>
-          </w:p>
-        </w:tc>
-        <w:tc>
-          <w:tcPr>
-            <w:tcW w:type="dxa" w:w="6803"/>
-            <w:shd w:fill="D6DCE4"/>
-          </w:tcPr>
-          <w:p>
-            <w:r/>
-            <w:r>
-              <w:rPr>
-                <w:sz w:val="20"/>
-              </w:rPr>
-              <w:t>Defined in a separate cutover plan</w:t>
-            </w:r>
-          </w:p>
-        </w:tc>
-      </w:tr>
-    </w:tbl>
+    <w:p>
+      <w:pPr>
+        <w:pStyle w:val="ListBullet"/>
+      </w:pPr>
+      <w:r>
+        <w:t>Any changes required in downstream systems consuming data from AEM are out of scope for Adobe.</w:t>
+      </w:r>
+    </w:p>
+    <w:p>
+      <w:pPr>
+        <w:pStyle w:val="ListBullet"/>
+      </w:pPr>
+      <w:r>
+        <w:t>Any changes required in external APIs providing data to or consuming data from EDS are out of scope for Adobe.</w:t>
+      </w:r>
+    </w:p>
     <w:p>
       <w:pPr>
         <w:pStyle w:val="Heading1"/>
@@ -3532,14 +2227,6 @@
         <w:t>5. Assumptions</w:t>
       </w:r>
     </w:p>
-    <w:p>
-      <w:pPr>
-        <w:pStyle w:val="Heading2"/>
-      </w:pPr>
-      <w:r>
-        <w:t>5.1 Platform &amp; Infrastructure</w:t>
-      </w:r>
-    </w:p>
     <w:tbl>
       <w:tblPr>
         <w:tblStyle w:val="TableGrid"/>
@@ -3612,7 +2299,7 @@
               <w:rPr>
                 <w:sz w:val="20"/>
               </w:rPr>
-              <w:t>AEM Edge Delivery Services (EDS) is the approved delivery platform for the US site.</w:t>
+              <w:t>Since this represents a fundamental shift in authoring experience, all customizations built on the current AEM Author environment (Touch UI extensions, custom dialogs, workflow steps) will not carry forward to EDS and must be re-evaluated against DA capabilities.</w:t>
             </w:r>
           </w:p>
         </w:tc>
@@ -3644,7 +2331,7 @@
               <w:rPr>
                 <w:sz w:val="20"/>
               </w:rPr>
-              <w:t>Document Authoring (DA) at da.live is the primary authoring interface — Universal Editor is not in scope.</w:t>
+              <w:t>For content migration to proceed, all pages must have a publicly accessible URL. Pages that are currently unpublished must be activated on a reachable URL prior to migration.</w:t>
             </w:r>
           </w:p>
         </w:tc>
@@ -3674,7 +2361,7 @@
               <w:rPr>
                 <w:sz w:val="20"/>
               </w:rPr>
-              <w:t>The EDS CDN (Adobe-managed) will be used for content delivery.</w:t>
+              <w:t>US/en will serve as the baseline site for MSM regional content copies. Regional pages with overridden (broken-inheritance) content must be identified and cataloged prior to migration to determine which require independent treatment.</w:t>
             </w:r>
           </w:p>
         </w:tc>
@@ -3706,817 +2393,7 @@
               <w:rPr>
                 <w:sz w:val="20"/>
               </w:rPr>
-              <w:t>GitHub is the code repository with automatic code sync to EDS on push.</w:t>
-            </w:r>
-          </w:p>
-        </w:tc>
-      </w:tr>
-      <w:tr>
-        <w:tc>
-          <w:tcPr>
-            <w:tcW w:type="dxa" w:w="850"/>
-          </w:tcPr>
-          <w:p>
-            <w:r/>
-            <w:r>
-              <w:rPr>
-                <w:sz w:val="20"/>
-              </w:rPr>
-              <w:t>A5</w:t>
-            </w:r>
-          </w:p>
-        </w:tc>
-        <w:tc>
-          <w:tcPr>
-            <w:tcW w:type="dxa" w:w="9354"/>
-          </w:tcPr>
-          <w:p>
-            <w:r/>
-            <w:r>
-              <w:rPr>
-                <w:sz w:val="20"/>
-              </w:rPr>
-              <w:t>The existing AEM 6.4 instance will continue serving pages not yet migrated (coexistence period).</w:t>
-            </w:r>
-          </w:p>
-        </w:tc>
-      </w:tr>
-    </w:tbl>
-    <w:p>
-      <w:pPr>
-        <w:pStyle w:val="Heading2"/>
-      </w:pPr>
-      <w:r>
-        <w:t>5.2 Content &amp; Authoring</w:t>
-      </w:r>
-    </w:p>
-    <w:tbl>
-      <w:tblPr>
-        <w:tblStyle w:val="TableGrid"/>
-        <w:tblW w:type="auto" w:w="0"/>
-        <w:jc w:val="left"/>
-        <w:tblLook w:firstColumn="1" w:firstRow="1" w:lastColumn="0" w:lastRow="0" w:noHBand="0" w:noVBand="1" w:val="04A0"/>
-      </w:tblPr>
-      <w:tblGrid>
-        <w:gridCol w:w="4320"/>
-        <w:gridCol w:w="4320"/>
-      </w:tblGrid>
-      <w:tr>
-        <w:tc>
-          <w:tcPr>
-            <w:tcW w:type="dxa" w:w="850"/>
-            <w:shd w:fill="2F5496"/>
-          </w:tcPr>
-          <w:p>
-            <w:r/>
-            <w:r>
-              <w:rPr>
-                <w:b/>
-                <w:color w:val="FFFFFF"/>
-                <w:sz w:val="20"/>
-              </w:rPr>
-              <w:t>#</w:t>
-            </w:r>
-          </w:p>
-        </w:tc>
-        <w:tc>
-          <w:tcPr>
-            <w:tcW w:type="dxa" w:w="9354"/>
-            <w:shd w:fill="2F5496"/>
-          </w:tcPr>
-          <w:p>
-            <w:r/>
-            <w:r>
-              <w:rPr>
-                <w:b/>
-                <w:color w:val="FFFFFF"/>
-                <w:sz w:val="20"/>
-              </w:rPr>
-              <w:t>Assumption</w:t>
-            </w:r>
-          </w:p>
-        </w:tc>
-      </w:tr>
-      <w:tr>
-        <w:tc>
-          <w:tcPr>
-            <w:tcW w:type="dxa" w:w="850"/>
-          </w:tcPr>
-          <w:p>
-            <w:r/>
-            <w:r>
-              <w:rPr>
-                <w:sz w:val="20"/>
-              </w:rPr>
-              <w:t>A6</w:t>
-            </w:r>
-          </w:p>
-        </w:tc>
-        <w:tc>
-          <w:tcPr>
-            <w:tcW w:type="dxa" w:w="9354"/>
-          </w:tcPr>
-          <w:p>
-            <w:r/>
-            <w:r>
-              <w:rPr>
-                <w:sz w:val="20"/>
-              </w:rPr>
-              <w:t>Authors will be trained on DA/EDS authoring model (table-based blocks, variants, fragments).</w:t>
-            </w:r>
-          </w:p>
-        </w:tc>
-      </w:tr>
-      <w:tr>
-        <w:tc>
-          <w:tcPr>
-            <w:tcW w:type="dxa" w:w="850"/>
-            <w:shd w:fill="D6DCE4"/>
-          </w:tcPr>
-          <w:p>
-            <w:r/>
-            <w:r>
-              <w:rPr>
-                <w:sz w:val="20"/>
-              </w:rPr>
-              <w:t>A7</w:t>
-            </w:r>
-          </w:p>
-        </w:tc>
-        <w:tc>
-          <w:tcPr>
-            <w:tcW w:type="dxa" w:w="9354"/>
-            <w:shd w:fill="D6DCE4"/>
-          </w:tcPr>
-          <w:p>
-            <w:r/>
-            <w:r>
-              <w:rPr>
-                <w:sz w:val="20"/>
-              </w:rPr>
-              <w:t>Content migration will be phased — priority pages identified by business stakeholders.</w:t>
-            </w:r>
-          </w:p>
-        </w:tc>
-      </w:tr>
-      <w:tr>
-        <w:tc>
-          <w:tcPr>
-            <w:tcW w:type="dxa" w:w="850"/>
-          </w:tcPr>
-          <w:p>
-            <w:r/>
-            <w:r>
-              <w:rPr>
-                <w:sz w:val="20"/>
-              </w:rPr>
-              <w:t>A8</w:t>
-            </w:r>
-          </w:p>
-        </w:tc>
-        <w:tc>
-          <w:tcPr>
-            <w:tcW w:type="dxa" w:w="9354"/>
-          </w:tcPr>
-          <w:p>
-            <w:r/>
-            <w:r>
-              <w:rPr>
-                <w:sz w:val="20"/>
-              </w:rPr>
-              <w:t>The H1 heading on pages is authored as default content above block tables, not inside blocks.</w:t>
-            </w:r>
-          </w:p>
-        </w:tc>
-      </w:tr>
-      <w:tr>
-        <w:tc>
-          <w:tcPr>
-            <w:tcW w:type="dxa" w:w="850"/>
-            <w:shd w:fill="D6DCE4"/>
-          </w:tcPr>
-          <w:p>
-            <w:r/>
-            <w:r>
-              <w:rPr>
-                <w:sz w:val="20"/>
-              </w:rPr>
-              <w:t>A9</w:t>
-            </w:r>
-          </w:p>
-        </w:tc>
-        <w:tc>
-          <w:tcPr>
-            <w:tcW w:type="dxa" w:w="9354"/>
-            <w:shd w:fill="D6DCE4"/>
-          </w:tcPr>
-          <w:p>
-            <w:r/>
-            <w:r>
-              <w:rPr>
-                <w:sz w:val="20"/>
-              </w:rPr>
-              <w:t>Breadcrumbs are auto-generated from site navigation hierarchy, not manually authored.</w:t>
-            </w:r>
-          </w:p>
-        </w:tc>
-      </w:tr>
-      <w:tr>
-        <w:tc>
-          <w:tcPr>
-            <w:tcW w:type="dxa" w:w="850"/>
-          </w:tcPr>
-          <w:p>
-            <w:r/>
-            <w:r>
-              <w:rPr>
-                <w:sz w:val="20"/>
-              </w:rPr>
-              <w:t>A10</w:t>
-            </w:r>
-          </w:p>
-        </w:tc>
-        <w:tc>
-          <w:tcPr>
-            <w:tcW w:type="dxa" w:w="9354"/>
-          </w:tcPr>
-          <w:p>
-            <w:r/>
-            <w:r>
-              <w:rPr>
-                <w:sz w:val="20"/>
-              </w:rPr>
-              <w:t>Fragment pages for complex nested content are authored as separate DA documents in /fragments/ path.</w:t>
-            </w:r>
-          </w:p>
-        </w:tc>
-      </w:tr>
-    </w:tbl>
-    <w:p>
-      <w:pPr>
-        <w:pStyle w:val="Heading2"/>
-      </w:pPr>
-      <w:r>
-        <w:t>5.3 Performance &amp; Quality</w:t>
-      </w:r>
-    </w:p>
-    <w:tbl>
-      <w:tblPr>
-        <w:tblStyle w:val="TableGrid"/>
-        <w:tblW w:type="auto" w:w="0"/>
-        <w:jc w:val="left"/>
-        <w:tblLook w:firstColumn="1" w:firstRow="1" w:lastColumn="0" w:lastRow="0" w:noHBand="0" w:noVBand="1" w:val="04A0"/>
-      </w:tblPr>
-      <w:tblGrid>
-        <w:gridCol w:w="4320"/>
-        <w:gridCol w:w="4320"/>
-      </w:tblGrid>
-      <w:tr>
-        <w:tc>
-          <w:tcPr>
-            <w:tcW w:type="dxa" w:w="850"/>
-            <w:shd w:fill="2F5496"/>
-          </w:tcPr>
-          <w:p>
-            <w:r/>
-            <w:r>
-              <w:rPr>
-                <w:b/>
-                <w:color w:val="FFFFFF"/>
-                <w:sz w:val="20"/>
-              </w:rPr>
-              <w:t>#</w:t>
-            </w:r>
-          </w:p>
-        </w:tc>
-        <w:tc>
-          <w:tcPr>
-            <w:tcW w:type="dxa" w:w="9354"/>
-            <w:shd w:fill="2F5496"/>
-          </w:tcPr>
-          <w:p>
-            <w:r/>
-            <w:r>
-              <w:rPr>
-                <w:b/>
-                <w:color w:val="FFFFFF"/>
-                <w:sz w:val="20"/>
-              </w:rPr>
-              <w:t>Assumption</w:t>
-            </w:r>
-          </w:p>
-        </w:tc>
-      </w:tr>
-      <w:tr>
-        <w:tc>
-          <w:tcPr>
-            <w:tcW w:type="dxa" w:w="850"/>
-          </w:tcPr>
-          <w:p>
-            <w:r/>
-            <w:r>
-              <w:rPr>
-                <w:sz w:val="20"/>
-              </w:rPr>
-              <w:t>A11</w:t>
-            </w:r>
-          </w:p>
-        </w:tc>
-        <w:tc>
-          <w:tcPr>
-            <w:tcW w:type="dxa" w:w="9354"/>
-          </w:tcPr>
-          <w:p>
-            <w:r/>
-            <w:r>
-              <w:rPr>
-                <w:sz w:val="20"/>
-              </w:rPr>
-              <w:t>Target is Lighthouse 100 on all Core Web Vitals (LCP &lt; 2.5s, CLS &lt; 0.1, INP &lt; 200ms).</w:t>
-            </w:r>
-          </w:p>
-        </w:tc>
-      </w:tr>
-      <w:tr>
-        <w:tc>
-          <w:tcPr>
-            <w:tcW w:type="dxa" w:w="850"/>
-            <w:shd w:fill="D6DCE4"/>
-          </w:tcPr>
-          <w:p>
-            <w:r/>
-            <w:r>
-              <w:rPr>
-                <w:sz w:val="20"/>
-              </w:rPr>
-              <w:t>A12</w:t>
-            </w:r>
-          </w:p>
-        </w:tc>
-        <w:tc>
-          <w:tcPr>
-            <w:tcW w:type="dxa" w:w="9354"/>
-            <w:shd w:fill="D6DCE4"/>
-          </w:tcPr>
-          <w:p>
-            <w:r/>
-            <w:r>
-              <w:rPr>
-                <w:sz w:val="20"/>
-              </w:rPr>
-              <w:t>EDS best practices ("keeping it 100") followed for all block implementations.</w:t>
-            </w:r>
-          </w:p>
-        </w:tc>
-      </w:tr>
-      <w:tr>
-        <w:tc>
-          <w:tcPr>
-            <w:tcW w:type="dxa" w:w="850"/>
-          </w:tcPr>
-          <w:p>
-            <w:r/>
-            <w:r>
-              <w:rPr>
-                <w:sz w:val="20"/>
-              </w:rPr>
-              <w:t>A13</w:t>
-            </w:r>
-          </w:p>
-        </w:tc>
-        <w:tc>
-          <w:tcPr>
-            <w:tcW w:type="dxa" w:w="9354"/>
-          </w:tcPr>
-          <w:p>
-            <w:r/>
-            <w:r>
-              <w:rPr>
-                <w:sz w:val="20"/>
-              </w:rPr>
-              <w:t>Third-party scripts loaded in delayed.js to avoid impacting LCP.</w:t>
-            </w:r>
-          </w:p>
-        </w:tc>
-      </w:tr>
-      <w:tr>
-        <w:tc>
-          <w:tcPr>
-            <w:tcW w:type="dxa" w:w="850"/>
-            <w:shd w:fill="D6DCE4"/>
-          </w:tcPr>
-          <w:p>
-            <w:r/>
-            <w:r>
-              <w:rPr>
-                <w:sz w:val="20"/>
-              </w:rPr>
-              <w:t>A14</w:t>
-            </w:r>
-          </w:p>
-        </w:tc>
-        <w:tc>
-          <w:tcPr>
-            <w:tcW w:type="dxa" w:w="9354"/>
-            <w:shd w:fill="D6DCE4"/>
-          </w:tcPr>
-          <w:p>
-            <w:r/>
-            <w:r>
-              <w:rPr>
-                <w:sz w:val="20"/>
-              </w:rPr>
-              <w:t>Images uploaded by authors are automatically optimized by EDS.</w:t>
-            </w:r>
-          </w:p>
-        </w:tc>
-      </w:tr>
-    </w:tbl>
-    <w:p>
-      <w:pPr>
-        <w:pStyle w:val="Heading2"/>
-      </w:pPr>
-      <w:r>
-        <w:t>5.4 Integrations</w:t>
-      </w:r>
-    </w:p>
-    <w:tbl>
-      <w:tblPr>
-        <w:tblStyle w:val="TableGrid"/>
-        <w:tblW w:type="auto" w:w="0"/>
-        <w:jc w:val="left"/>
-        <w:tblLook w:firstColumn="1" w:firstRow="1" w:lastColumn="0" w:lastRow="0" w:noHBand="0" w:noVBand="1" w:val="04A0"/>
-      </w:tblPr>
-      <w:tblGrid>
-        <w:gridCol w:w="4320"/>
-        <w:gridCol w:w="4320"/>
-      </w:tblGrid>
-      <w:tr>
-        <w:tc>
-          <w:tcPr>
-            <w:tcW w:type="dxa" w:w="850"/>
-            <w:shd w:fill="2F5496"/>
-          </w:tcPr>
-          <w:p>
-            <w:r/>
-            <w:r>
-              <w:rPr>
-                <w:b/>
-                <w:color w:val="FFFFFF"/>
-                <w:sz w:val="20"/>
-              </w:rPr>
-              <w:t>#</w:t>
-            </w:r>
-          </w:p>
-        </w:tc>
-        <w:tc>
-          <w:tcPr>
-            <w:tcW w:type="dxa" w:w="9354"/>
-            <w:shd w:fill="2F5496"/>
-          </w:tcPr>
-          <w:p>
-            <w:r/>
-            <w:r>
-              <w:rPr>
-                <w:b/>
-                <w:color w:val="FFFFFF"/>
-                <w:sz w:val="20"/>
-              </w:rPr>
-              <w:t>Assumption</w:t>
-            </w:r>
-          </w:p>
-        </w:tc>
-      </w:tr>
-      <w:tr>
-        <w:tc>
-          <w:tcPr>
-            <w:tcW w:type="dxa" w:w="850"/>
-          </w:tcPr>
-          <w:p>
-            <w:r/>
-            <w:r>
-              <w:rPr>
-                <w:sz w:val="20"/>
-              </w:rPr>
-              <w:t>A15</w:t>
-            </w:r>
-          </w:p>
-        </w:tc>
-        <w:tc>
-          <w:tcPr>
-            <w:tcW w:type="dxa" w:w="9354"/>
-          </w:tcPr>
-          <w:p>
-            <w:r/>
-            <w:r>
-              <w:rPr>
-                <w:sz w:val="20"/>
-              </w:rPr>
-              <w:t>Brightcove is the approved video platform.</w:t>
-            </w:r>
-          </w:p>
-        </w:tc>
-      </w:tr>
-      <w:tr>
-        <w:tc>
-          <w:tcPr>
-            <w:tcW w:type="dxa" w:w="850"/>
-            <w:shd w:fill="D6DCE4"/>
-          </w:tcPr>
-          <w:p>
-            <w:r/>
-            <w:r>
-              <w:rPr>
-                <w:sz w:val="20"/>
-              </w:rPr>
-              <w:t>A16</w:t>
-            </w:r>
-          </w:p>
-        </w:tc>
-        <w:tc>
-          <w:tcPr>
-            <w:tcW w:type="dxa" w:w="9354"/>
-            <w:shd w:fill="D6DCE4"/>
-          </w:tcPr>
-          <w:p>
-            <w:r/>
-            <w:r>
-              <w:rPr>
-                <w:sz w:val="20"/>
-              </w:rPr>
-              <w:t>Product data API contract for PDPs will be provided by the PDP team.</w:t>
-            </w:r>
-          </w:p>
-        </w:tc>
-      </w:tr>
-      <w:tr>
-        <w:tc>
-          <w:tcPr>
-            <w:tcW w:type="dxa" w:w="850"/>
-          </w:tcPr>
-          <w:p>
-            <w:r/>
-            <w:r>
-              <w:rPr>
-                <w:sz w:val="20"/>
-              </w:rPr>
-              <w:t>A17</w:t>
-            </w:r>
-          </w:p>
-        </w:tc>
-        <w:tc>
-          <w:tcPr>
-            <w:tcW w:type="dxa" w:w="9354"/>
-          </w:tcPr>
-          <w:p>
-            <w:r/>
-            <w:r>
-              <w:rPr>
-                <w:sz w:val="20"/>
-              </w:rPr>
-              <w:t>Form submission endpoints and business logic provided by backend/integration team.</w:t>
-            </w:r>
-          </w:p>
-        </w:tc>
-      </w:tr>
-      <w:tr>
-        <w:tc>
-          <w:tcPr>
-            <w:tcW w:type="dxa" w:w="850"/>
-            <w:shd w:fill="D6DCE4"/>
-          </w:tcPr>
-          <w:p>
-            <w:r/>
-            <w:r>
-              <w:rPr>
-                <w:sz w:val="20"/>
-              </w:rPr>
-              <w:t>A18</w:t>
-            </w:r>
-          </w:p>
-        </w:tc>
-        <w:tc>
-          <w:tcPr>
-            <w:tcW w:type="dxa" w:w="9354"/>
-            <w:shd w:fill="D6DCE4"/>
-          </w:tcPr>
-          <w:p>
-            <w:r/>
-            <w:r>
-              <w:rPr>
-                <w:sz w:val="20"/>
-              </w:rPr>
-              <w:t>Adobe Analytics/Target integration uses a data layer approach compatible with EDS performance.</w:t>
-            </w:r>
-          </w:p>
-        </w:tc>
-      </w:tr>
-    </w:tbl>
-    <w:p>
-      <w:pPr>
-        <w:pStyle w:val="Heading2"/>
-      </w:pPr>
-      <w:r>
-        <w:t>5.5 Migration &amp; Team</w:t>
-      </w:r>
-    </w:p>
-    <w:tbl>
-      <w:tblPr>
-        <w:tblStyle w:val="TableGrid"/>
-        <w:tblW w:type="auto" w:w="0"/>
-        <w:jc w:val="left"/>
-        <w:tblLook w:firstColumn="1" w:firstRow="1" w:lastColumn="0" w:lastRow="0" w:noHBand="0" w:noVBand="1" w:val="04A0"/>
-      </w:tblPr>
-      <w:tblGrid>
-        <w:gridCol w:w="4320"/>
-        <w:gridCol w:w="4320"/>
-      </w:tblGrid>
-      <w:tr>
-        <w:tc>
-          <w:tcPr>
-            <w:tcW w:type="dxa" w:w="850"/>
-            <w:shd w:fill="2F5496"/>
-          </w:tcPr>
-          <w:p>
-            <w:r/>
-            <w:r>
-              <w:rPr>
-                <w:b/>
-                <w:color w:val="FFFFFF"/>
-                <w:sz w:val="20"/>
-              </w:rPr>
-              <w:t>#</w:t>
-            </w:r>
-          </w:p>
-        </w:tc>
-        <w:tc>
-          <w:tcPr>
-            <w:tcW w:type="dxa" w:w="9354"/>
-            <w:shd w:fill="2F5496"/>
-          </w:tcPr>
-          <w:p>
-            <w:r/>
-            <w:r>
-              <w:rPr>
-                <w:b/>
-                <w:color w:val="FFFFFF"/>
-                <w:sz w:val="20"/>
-              </w:rPr>
-              <w:t>Assumption</w:t>
-            </w:r>
-          </w:p>
-        </w:tc>
-      </w:tr>
-      <w:tr>
-        <w:tc>
-          <w:tcPr>
-            <w:tcW w:type="dxa" w:w="850"/>
-          </w:tcPr>
-          <w:p>
-            <w:r/>
-            <w:r>
-              <w:rPr>
-                <w:sz w:val="20"/>
-              </w:rPr>
-              <w:t>A19</w:t>
-            </w:r>
-          </w:p>
-        </w:tc>
-        <w:tc>
-          <w:tcPr>
-            <w:tcW w:type="dxa" w:w="9354"/>
-          </w:tcPr>
-          <w:p>
-            <w:r/>
-            <w:r>
-              <w:rPr>
-                <w:sz w:val="20"/>
-              </w:rPr>
-              <w:t>Content mapping from AEM 6.4 components to EDS blocks agreed upon before migration.</w:t>
-            </w:r>
-          </w:p>
-        </w:tc>
-      </w:tr>
-      <w:tr>
-        <w:tc>
-          <w:tcPr>
-            <w:tcW w:type="dxa" w:w="850"/>
-            <w:shd w:fill="D6DCE4"/>
-          </w:tcPr>
-          <w:p>
-            <w:r/>
-            <w:r>
-              <w:rPr>
-                <w:sz w:val="20"/>
-              </w:rPr>
-              <w:t>A20</w:t>
-            </w:r>
-          </w:p>
-        </w:tc>
-        <w:tc>
-          <w:tcPr>
-            <w:tcW w:type="dxa" w:w="9354"/>
-            <w:shd w:fill="D6DCE4"/>
-          </w:tcPr>
-          <w:p>
-            <w:r/>
-            <w:r>
-              <w:rPr>
-                <w:sz w:val="20"/>
-              </w:rPr>
-              <w:t>URL structure and redirect strategy defined collaboratively with SEO and engineering.</w:t>
-            </w:r>
-          </w:p>
-        </w:tc>
-      </w:tr>
-      <w:tr>
-        <w:tc>
-          <w:tcPr>
-            <w:tcW w:type="dxa" w:w="850"/>
-          </w:tcPr>
-          <w:p>
-            <w:r/>
-            <w:r>
-              <w:rPr>
-                <w:sz w:val="20"/>
-              </w:rPr>
-              <w:t>A21</w:t>
-            </w:r>
-          </w:p>
-        </w:tc>
-        <w:tc>
-          <w:tcPr>
-            <w:tcW w:type="dxa" w:w="9354"/>
-          </w:tcPr>
-          <w:p>
-            <w:r/>
-            <w:r>
-              <w:rPr>
-                <w:sz w:val="20"/>
-              </w:rPr>
-              <w:t>KPI baselines captured before migration for before/after comparison.</w:t>
-            </w:r>
-          </w:p>
-        </w:tc>
-      </w:tr>
-      <w:tr>
-        <w:tc>
-          <w:tcPr>
-            <w:tcW w:type="dxa" w:w="850"/>
-            <w:shd w:fill="D6DCE4"/>
-          </w:tcPr>
-          <w:p>
-            <w:r/>
-            <w:r>
-              <w:rPr>
-                <w:sz w:val="20"/>
-              </w:rPr>
-              <w:t>A22</w:t>
-            </w:r>
-          </w:p>
-        </w:tc>
-        <w:tc>
-          <w:tcPr>
-            <w:tcW w:type="dxa" w:w="9354"/>
-            <w:shd w:fill="D6DCE4"/>
-          </w:tcPr>
-          <w:p>
-            <w:r/>
-            <w:r>
-              <w:rPr>
-                <w:sz w:val="20"/>
-              </w:rPr>
-              <w:t>Development team has GitHub access with branch protection and review processes.</w:t>
-            </w:r>
-          </w:p>
-        </w:tc>
-      </w:tr>
-      <w:tr>
-        <w:tc>
-          <w:tcPr>
-            <w:tcW w:type="dxa" w:w="850"/>
-          </w:tcPr>
-          <w:p>
-            <w:r/>
-            <w:r>
-              <w:rPr>
-                <w:sz w:val="20"/>
-              </w:rPr>
-              <w:t>A23</w:t>
-            </w:r>
-          </w:p>
-        </w:tc>
-        <w:tc>
-          <w:tcPr>
-            <w:tcW w:type="dxa" w:w="9354"/>
-          </w:tcPr>
-          <w:p>
-            <w:r/>
-            <w:r>
-              <w:rPr>
-                <w:sz w:val="20"/>
-              </w:rPr>
-              <w:t>Code changes follow EDS publishing process: feature branch → PR → review → merge.</w:t>
+              <w:t>Before the implementation phase begins, Thermo Fisher must finalize the decision on which Edge Worker (CDN edge compute) pattern will be used for the project.</w:t>
             </w:r>
           </w:p>
         </w:tc>

</xml_diff>